<commit_message>
HIT-47: complete remaining 0302 report fields
</commit_message>
<xml_diff>
--- a/docs/labs/pr12/ds/reports/0302-pz01-ds.docx
+++ b/docs/labs/pr12/ds/reports/0302-pz01-ds.docx
@@ -1073,12 +1073,12 @@
     </w:p>
     <w:p>
       <w:r>
-        <w:t xml:space="preserve">Цель работы: </w:t>
-      </w:r>
-    </w:p>
-    <w:p>
-      <w:r>
-        <w:t xml:space="preserve">Задача на рассматриваемом участке проекта: </w:t>
+        <w:t>Цель работы: проверить соответствие реализации модуля TargetReadback требованиям, тестам и ограничениям проекта.</w:t>
+      </w:r>
+    </w:p>
+    <w:p>
+      <w:r>
+        <w:t>Задача на рассматриваемом участке проекта: сопоставить требования, изменения в PR и результаты автоматических проверок.</w:t>
       </w:r>
     </w:p>
     <w:p>
@@ -1553,12 +1553,12 @@
     </w:p>
     <w:p>
       <w:r>
-        <w:t>Пользователь и полезный сценарий: .</w:t>
-      </w:r>
-    </w:p>
-    <w:p>
-      <w:r>
-        <w:t>Постановка задачи: .</w:t>
+        <w:t>Пользователь и полезный сценарий: разработчик или проверяющий получает подтверждённое состояние задачи без ложного match; сценарий — безопасная offline-проверка сохранённого наблюдения.</w:t>
+      </w:r>
+    </w:p>
+    <w:p>
+      <w:r>
+        <w:t>Постановка задачи: реализовать сравнение ожидаемых и фактически сохранённых атрибутов с результатами match, mismatch, incomplete и unknown.</w:t>
       </w:r>
     </w:p>
     <w:tbl>
@@ -1784,17 +1784,17 @@
     </w:p>
     <w:p>
       <w:r>
-        <w:t>Подтверждённые условия: . Предположения: . Открытые вопросы, ответственные: .</w:t>
-      </w:r>
-    </w:p>
-    <w:p>
-      <w:r>
-        <w:t>Связь с MVP: .</w:t>
-      </w:r>
-    </w:p>
-    <w:p>
-      <w:r>
-        <w:t>Общие материалы: .</w:t>
+        <w:t>Подтверждённые условия: требования FR-1–FR-4, NFR-2 и контракт T/013. Предположения: проверяется offline-срез с сохранёнными данными. Открытые вопросы, ответственные: live-права провайдера и человеческая приёмка остаются за рамками этой работы.</w:t>
+      </w:r>
+    </w:p>
+    <w:p>
+      <w:r>
+        <w:t>Связь с MVP: модуль даёт безопасный результат проверки задачи и не подтверждает действие только по отсутствию данных.</w:t>
+      </w:r>
+    </w:p>
+    <w:p>
+      <w:r>
+        <w:t>Общие материалы: requirements.md, security-baseline.md, module-contract.md, module-map.md, PR #29 и журналы evidence.</w:t>
       </w:r>
     </w:p>
     <w:p>
@@ -2361,7 +2361,7 @@
     </w:p>
     <w:p>
       <w:r>
-        <w:t>Исходные данные и подготовка состояния: .</w:t>
+        <w:t>Исходные данные и подготовка состояния: сохранённые JSON-наблюдения, fixtures и тестовые адаптеры; перед проверкой выполняются go test, go vet и smoke.</w:t>
       </w:r>
     </w:p>
     <w:p>
@@ -2379,17 +2379,17 @@
     </w:p>
     <w:p>
       <w:r>
-        <w:t>Причина и задача: . Ссылка на изменение: .</w:t>
-      </w:r>
-    </w:p>
-    <w:p>
-      <w:r>
-        <w:t>Применение DoD: .</w:t>
-      </w:r>
-    </w:p>
-    <w:p>
-      <w:r>
-        <w:t>Значимость и review: .</w:t>
+        <w:t>Причина и задача: устранить ложные подтверждения и проверить границы контракта. Ссылка на изменение: https://github.com/hitpipe/hitpipe/pull/29.</w:t>
+      </w:r>
+    </w:p>
+    <w:p>
+      <w:r>
+        <w:t>Применение DoD: требования сопоставлены с тестами, мутации обнаружены, исходный код восстановлен, журналы и ограничения сохранены.</w:t>
+      </w:r>
+    </w:p>
+    <w:p>
+      <w:r>
+        <w:t>Значимость и review: результаты предназначены для повторной проверки; PR #29 остаётся открытым, merge и approve не выполнялись.</w:t>
       </w:r>
     </w:p>
     <w:p>
@@ -2412,7 +2412,7 @@
     </w:p>
     <w:p>
       <w:r>
-        <w:t>Порядок заполнения граф:</w:t>
+        <w:t>Порядок заполнения граф: сначала фиксируются требование и риск, затем ожидаемый результат, команда проверки, фактический результат и ссылка на журнал.</w:t>
       </w:r>
     </w:p>
     <w:p>
@@ -3294,7 +3294,7 @@
     </w:p>
     <w:p>
       <w:r>
-        <w:t>Будущие проверки: .</w:t>
+        <w:t>Будущие проверки: live-права провайдера, интеграционный сценарий и человеческая приёмка после доступности соответствующего окружения.</w:t>
       </w:r>
     </w:p>
     <w:p>
@@ -3486,7 +3486,7 @@
     </w:p>
     <w:p>
       <w:r>
-        <w:t>Общие материалы и результаты других участников: .</w:t>
+        <w:t>Общие материалы и результаты других участников: требования проекта, PR #29, CI-запуски и независимое воспроизведение части другого студента приведены по прямым ссылкам в отчёте.</w:t>
       </w:r>
     </w:p>
     <w:p>
@@ -3499,7 +3499,7 @@
     </w:p>
     <w:p>
       <w:r>
-        <w:t>Вывод: .</w:t>
+        <w:t>Вывод: требования и риски сопоставлены с реализацией и тестами; offline-проверки выполнены, ограничения явно зафиксированы.</w:t>
       </w:r>
     </w:p>
     <w:p>

</xml_diff>

<commit_message>
add detailed review of Nikita work to report
</commit_message>
<xml_diff>
--- a/docs/labs/pr12/ds/reports/0302-pz01-ds.docx
+++ b/docs/labs/pr12/ds/reports/0302-pz01-ds.docx
@@ -2729,6 +2729,346 @@
       </w:pPr>
       <w:r>
         <w:t>Рисунок 2 — Автоматические проверки изменения требований</w:t>
+      </w:r>
+    </w:p>
+    <w:p>
+      <w:pPr>
+        <w:pStyle w:val="2"/>
+      </w:pPr>
+      <w:r>
+        <w:t>3.1 Подробное ревью работы Никиты Будыкина</w:t>
+      </w:r>
+    </w:p>
+    <w:p>
+      <w:r>
+        <w:t>В рамках оппонирования рассмотрена работа Никиты Будыкина по модулю Intake / StripeSignature: задачи HIT-49–HIT-56, кодовые PR №31–33 и пакет отчётов PR №34. Проверка выполнена по опубликованным изменениям и повторному ревью PR №36. Ревью не является личной аттестацией студента и не заменяет преподавательскую приёмку.</w:t>
+      </w:r>
+    </w:p>
+    <w:p>
+      <w:r>
+        <w:t>Сильные стороны работы. В кодовой части реализована проверка подписи Stripe по исходным байтам тела запроса, предусмотрены безопасные результаты отказа, тестовые fixtures и сменные зависимости для секрета и часов. В зафиксированных запусках прошли именованные тесты, go vet, race-проверка, dev/release smoke и четыре независимых HMAC-вектора. Также были проверены границы свежести 299/300/301 секунд и сценарии повреждённого тела. Эти результаты подтверждают техническую основу модуля, но не доказывают наличие live Stripe-доставки, durable receipt, 2xx-приёма или формальной приёмки проекта.</w:t>
+      </w:r>
+    </w:p>
+    <w:p>
+      <w:r>
+        <w:t>Найденные замечания. Повторное ревью PR №36 сохранило статус CHANGES_REQUIRED. Ниже приведены только конкретные замечания, имеющие привязку к файлу, проверке или статусу артефакта.</w:t>
+      </w:r>
+    </w:p>
+    <w:tbl>
+      <w:tblPr>
+        <w:tblStyle w:val="af4"/>
+        <w:tblW w:type="auto" w:w="0"/>
+        <w:tblLook w:firstColumn="1" w:firstRow="1" w:lastColumn="0" w:lastRow="0" w:noHBand="0" w:noVBand="1" w:val="04A0"/>
+      </w:tblPr>
+      <w:tblGrid>
+        <w:gridCol w:w="2339"/>
+        <w:gridCol w:w="2339"/>
+        <w:gridCol w:w="2339"/>
+        <w:gridCol w:w="2339"/>
+      </w:tblGrid>
+      <w:tr>
+        <w:tc>
+          <w:tcPr>
+            <w:tcW w:type="dxa" w:w="2339"/>
+          </w:tcPr>
+          <w:p>
+            <w:r>
+              <w:t>№</w:t>
+            </w:r>
+          </w:p>
+        </w:tc>
+        <w:tc>
+          <w:tcPr>
+            <w:tcW w:type="dxa" w:w="2339"/>
+          </w:tcPr>
+          <w:p>
+            <w:r>
+              <w:t>Что проверено</w:t>
+            </w:r>
+          </w:p>
+        </w:tc>
+        <w:tc>
+          <w:tcPr>
+            <w:tcW w:type="dxa" w:w="2339"/>
+          </w:tcPr>
+          <w:p>
+            <w:r>
+              <w:t>Результат ревью</w:t>
+            </w:r>
+          </w:p>
+        </w:tc>
+        <w:tc>
+          <w:tcPr>
+            <w:tcW w:type="dxa" w:w="2339"/>
+          </w:tcPr>
+          <w:p>
+            <w:r>
+              <w:t>Что требуется сделать</w:t>
+            </w:r>
+          </w:p>
+        </w:tc>
+      </w:tr>
+      <w:tr>
+        <w:tc>
+          <w:tcPr>
+            <w:tcW w:type="dxa" w:w="2339"/>
+          </w:tcPr>
+          <w:p>
+            <w:r>
+              <w:t>1</w:t>
+            </w:r>
+          </w:p>
+        </w:tc>
+        <w:tc>
+          <w:tcPr>
+            <w:tcW w:type="dxa" w:w="2339"/>
+          </w:tcPr>
+          <w:p>
+            <w:r>
+              <w:t>Отчёты 0104-ПР1</w:t>
+            </w:r>
+          </w:p>
+        </w:tc>
+        <w:tc>
+          <w:tcPr>
+            <w:tcW w:type="dxa" w:w="2339"/>
+          </w:tcPr>
+          <w:p>
+            <w:r>
+              <w:t>В таблице dev/release оставлены общие значения NOT RUN/PASS вместо конкретных команд, путей, SHA и фактических итогов.</w:t>
+            </w:r>
+          </w:p>
+        </w:tc>
+        <w:tc>
+          <w:tcPr>
+            <w:tcW w:type="dxa" w:w="2339"/>
+          </w:tcPr>
+          <w:p>
+            <w:r>
+              <w:t>Заполнить каждую строку реальными результатами и отделить выполненное от планируемого.</w:t>
+            </w:r>
+          </w:p>
+        </w:tc>
+      </w:tr>
+      <w:tr>
+        <w:tc>
+          <w:tcPr>
+            <w:tcW w:type="dxa" w:w="2339"/>
+          </w:tcPr>
+          <w:p>
+            <w:r>
+              <w:t>2</w:t>
+            </w:r>
+          </w:p>
+        </w:tc>
+        <w:tc>
+          <w:tcPr>
+            <w:tcW w:type="dxa" w:w="2339"/>
+          </w:tcPr>
+          <w:p>
+            <w:r>
+              <w:t>Отчёт 0302-ПР1</w:t>
+            </w:r>
+          </w:p>
+        </w:tc>
+        <w:tc>
+          <w:tcPr>
+            <w:tcW w:type="dxa" w:w="2339"/>
+          </w:tcPr>
+          <w:p>
+            <w:r>
+              <w:t>Строка технических результатов осталась пустой; читателю не видно, какие проверки реально выполнены.</w:t>
+            </w:r>
+          </w:p>
+        </w:tc>
+        <w:tc>
+          <w:tcPr>
+            <w:tcW w:type="dxa" w:w="2339"/>
+          </w:tcPr>
+          <w:p>
+            <w:r>
+              <w:t>Добавить команды, exit code, журналы и ограничения для каждой проверки.</w:t>
+            </w:r>
+          </w:p>
+        </w:tc>
+      </w:tr>
+      <w:tr>
+        <w:tc>
+          <w:tcPr>
+            <w:tcW w:type="dxa" w:w="2339"/>
+          </w:tcPr>
+          <w:p>
+            <w:r>
+              <w:t>3</w:t>
+            </w:r>
+          </w:p>
+        </w:tc>
+        <w:tc>
+          <w:tcPr>
+            <w:tcW w:type="dxa" w:w="2339"/>
+          </w:tcPr>
+          <w:p>
+            <w:r>
+              <w:t>Трассировка требований</w:t>
+            </w:r>
+          </w:p>
+        </w:tc>
+        <w:tc>
+          <w:tcPr>
+            <w:tcW w:type="dxa" w:w="2339"/>
+          </w:tcPr>
+          <w:p>
+            <w:r>
+              <w:t>В DOCX сохранились ссылки FR-SIG-03/NFR-SIG-01 на BP007/T010, хотя исправленный JSON уже указывает безопасные ошибки и privacy-ограничения по другим пунктам.</w:t>
+            </w:r>
+          </w:p>
+        </w:tc>
+        <w:tc>
+          <w:tcPr>
+            <w:tcW w:type="dxa" w:w="2339"/>
+          </w:tcPr>
+          <w:p>
+            <w:r>
+              <w:t>Синхронизировать DOCX, JSON-трассировку и таблицы требований; не оставлять противоречащие ссылки.</w:t>
+            </w:r>
+          </w:p>
+        </w:tc>
+      </w:tr>
+      <w:tr>
+        <w:tc>
+          <w:tcPr>
+            <w:tcW w:type="dxa" w:w="2339"/>
+          </w:tcPr>
+          <w:p>
+            <w:r>
+              <w:t>4</w:t>
+            </w:r>
+          </w:p>
+        </w:tc>
+        <w:tc>
+          <w:tcPr>
+            <w:tcW w:type="dxa" w:w="2339"/>
+          </w:tcPr>
+          <w:p>
+            <w:r>
+              <w:t>Статус человеческих ворот</w:t>
+            </w:r>
+          </w:p>
+        </w:tc>
+        <w:tc>
+          <w:tcPr>
+            <w:tcW w:type="dxa" w:w="2339"/>
+          </w:tcPr>
+          <w:p>
+            <w:r>
+              <w:t>В 0302-ПР1 часть проверки обозначена как human-gated, хотя для неё зафиксирован gate=none; это меняет смысл результата.</w:t>
+            </w:r>
+          </w:p>
+        </w:tc>
+        <w:tc>
+          <w:tcPr>
+            <w:tcW w:type="dxa" w:w="2339"/>
+          </w:tcPr>
+          <w:p>
+            <w:r>
+              <w:t>Исправить статус на фактический и отдельно указать только реально ожидаемые действия человека.</w:t>
+            </w:r>
+          </w:p>
+        </w:tc>
+      </w:tr>
+      <w:tr>
+        <w:tc>
+          <w:tcPr>
+            <w:tcW w:type="dxa" w:w="2339"/>
+          </w:tcPr>
+          <w:p>
+            <w:r>
+              <w:t>5</w:t>
+            </w:r>
+          </w:p>
+        </w:tc>
+        <w:tc>
+          <w:tcPr>
+            <w:tcW w:type="dxa" w:w="2339"/>
+          </w:tcPr>
+          <w:p>
+            <w:r>
+              <w:t>Инструкции скриншотов</w:t>
+            </w:r>
+          </w:p>
+        </w:tc>
+        <w:tc>
+          <w:tcPr>
+            <w:tcW w:type="dxa" w:w="2339"/>
+          </w:tcPr>
+          <w:p>
+            <w:r>
+              <w:t>В инструкции 0104-ПР1-05 команда содержала текстовое пояснение внутри argv, из-за чего воспроизведение давало синтаксическую ошибку; cwd и пути к binary/fixture также были неточными.</w:t>
+            </w:r>
+          </w:p>
+        </w:tc>
+        <w:tc>
+          <w:tcPr>
+            <w:tcW w:type="dxa" w:w="2339"/>
+          </w:tcPr>
+          <w:p>
+            <w:r>
+              <w:t>Оставить в команде только исполняемые аргументы, явно указать настоящий cwd и доступные полные SHA.</w:t>
+            </w:r>
+          </w:p>
+        </w:tc>
+      </w:tr>
+      <w:tr>
+        <w:tc>
+          <w:tcPr>
+            <w:tcW w:type="dxa" w:w="2339"/>
+          </w:tcPr>
+          <w:p>
+            <w:r>
+              <w:t>6</w:t>
+            </w:r>
+          </w:p>
+        </w:tc>
+        <w:tc>
+          <w:tcPr>
+            <w:tcW w:type="dxa" w:w="2339"/>
+          </w:tcPr>
+          <w:p>
+            <w:r>
+              <w:t>Трассировка задач и mutation evidence</w:t>
+            </w:r>
+          </w:p>
+        </w:tc>
+        <w:tc>
+          <w:tcPr>
+            <w:tcW w:type="dxa" w:w="2339"/>
+          </w:tcPr>
+          <w:p>
+            <w:r>
+              <w:t>Не хватало прямых mappings для HIT-49/HIT-50/HIT-54/HIT-55; mutation evidence требовало обновления под текущий исходный код.</w:t>
+            </w:r>
+          </w:p>
+        </w:tc>
+        <w:tc>
+          <w:tcPr>
+            <w:tcW w:type="dxa" w:w="2339"/>
+          </w:tcPr>
+          <w:p>
+            <w:r>
+              <w:t>Добавить task→branch→PR→commit→test→evidence и повторить мутации на том же source SHA.</w:t>
+            </w:r>
+          </w:p>
+        </w:tc>
+      </w:tr>
+    </w:tbl>
+    <w:p>
+      <w:r>
+        <w:t>Решение по результатам ревью. Работа содержит существенную техническую основу и воспроизводимые положительные проверки, однако пакет нельзя считать готовым к приёмке из-за несогласованности отчётов, неполных технических таблиц, ошибочных команд воспроизведения и неполной трассировки. Итоговый статус — CHANGES_REQUIRED. Для повторного рассмотрения нужны исправленные DOCX/JSON, актуальный журнал мутаций, доступные SHA и повторная проверка всех затронутых инструкций.</w:t>
+      </w:r>
+    </w:p>
+    <w:p>
+      <w:r>
+        <w:t>Источники ревью: PR №31 — https://github.com/hitpipe/hitpipe/pull/31; PR №32 — https://github.com/hitpipe/hitpipe/pull/32; PR №33 — https://github.com/hitpipe/hitpipe/pull/33; пакет отчётов PR №34 — https://github.com/hitpipe/hitpipe/pull/34; повторное ревью PR №36 — https://github.com/hitpipe/hitpipe/pull/36.</w:t>
       </w:r>
     </w:p>
     <w:p>

</xml_diff>

<commit_message>
expand Nikita technical and scaffold review
</commit_message>
<xml_diff>
--- a/docs/labs/pr12/ds/reports/0302-pz01-ds.docx
+++ b/docs/labs/pr12/ds/reports/0302-pz01-ds.docx
@@ -3069,6 +3069,841 @@
     <w:p>
       <w:r>
         <w:t>Источники ревью: PR №31 — https://github.com/hitpipe/hitpipe/pull/31; PR №32 — https://github.com/hitpipe/hitpipe/pull/32; PR №33 — https://github.com/hitpipe/hitpipe/pull/33; пакет отчётов PR №34 — https://github.com/hitpipe/hitpipe/pull/34; повторное ревью PR №36 — https://github.com/hitpipe/hitpipe/pull/36.</w:t>
+      </w:r>
+    </w:p>
+    <w:p>
+      <w:pPr>
+        <w:pStyle w:val="2"/>
+      </w:pPr>
+      <w:r>
+        <w:t>3.2 Оценка технического вклада Никиты Будыкина</w:t>
+      </w:r>
+    </w:p>
+    <w:p>
+      <w:r>
+        <w:t>Проверены доступные авторские PR Никиты в репозитории hitpipe/hitpipe: №31 (HIT-51, StripeSignature), №32 (HIT-52, AuthenticateWebhook), №33 (HIT-53, timestamp verification и mutation evidence), №37 (HIT-49, requirements baseline), №38 (HIT-50, requirement refinement), №39 (HIT-54, toolchain) и №40 (HIT-55, human-gate handoff). Оценка ниже относится к опубликованным артефактам, а не к устному рассказу или неподтверждённому участию.</w:t>
+      </w:r>
+    </w:p>
+    <w:tbl>
+      <w:tblPr>
+        <w:tblStyle w:val="af4"/>
+        <w:tblW w:type="auto" w:w="0"/>
+        <w:tblLook w:firstColumn="1" w:firstRow="1" w:lastColumn="0" w:lastRow="0" w:noHBand="0" w:noVBand="1" w:val="04A0"/>
+      </w:tblPr>
+      <w:tblGrid>
+        <w:gridCol w:w="2339"/>
+        <w:gridCol w:w="2339"/>
+        <w:gridCol w:w="2339"/>
+        <w:gridCol w:w="2339"/>
+      </w:tblGrid>
+      <w:tr>
+        <w:tc>
+          <w:tcPr>
+            <w:tcW w:type="dxa" w:w="2339"/>
+          </w:tcPr>
+          <w:p>
+            <w:r>
+              <w:t>Направление</w:t>
+            </w:r>
+          </w:p>
+        </w:tc>
+        <w:tc>
+          <w:tcPr>
+            <w:tcW w:type="dxa" w:w="2339"/>
+          </w:tcPr>
+          <w:p>
+            <w:r>
+              <w:t>Статус</w:t>
+            </w:r>
+          </w:p>
+        </w:tc>
+        <w:tc>
+          <w:tcPr>
+            <w:tcW w:type="dxa" w:w="2339"/>
+          </w:tcPr>
+          <w:p>
+            <w:r>
+              <w:t>Подтверждение</w:t>
+            </w:r>
+          </w:p>
+        </w:tc>
+        <w:tc>
+          <w:tcPr>
+            <w:tcW w:type="dxa" w:w="2339"/>
+          </w:tcPr>
+          <w:p>
+            <w:r>
+              <w:t>Вывод</w:t>
+            </w:r>
+          </w:p>
+        </w:tc>
+      </w:tr>
+      <w:tr>
+        <w:tc>
+          <w:tcPr>
+            <w:tcW w:type="dxa" w:w="2339"/>
+          </w:tcPr>
+          <w:p>
+            <w:r>
+              <w:t>Качество кода и тестов</w:t>
+            </w:r>
+          </w:p>
+        </w:tc>
+        <w:tc>
+          <w:tcPr>
+            <w:tcW w:type="dxa" w:w="2339"/>
+          </w:tcPr>
+          <w:p>
+            <w:r>
+              <w:t>Pass / Partial</w:t>
+            </w:r>
+          </w:p>
+        </w:tc>
+        <w:tc>
+          <w:tcPr>
+            <w:tcW w:type="dxa" w:w="2339"/>
+          </w:tcPr>
+          <w:p>
+            <w:r>
+              <w:t>PR31 содержит verifier и тесты; PR32 — consumer, порты, adapters и application tests; PR33 — boundary tests и mutation protocol.</w:t>
+            </w:r>
+          </w:p>
+        </w:tc>
+        <w:tc>
+          <w:tcPr>
+            <w:tcW w:type="dxa" w:w="2339"/>
+          </w:tcPr>
+          <w:p>
+            <w:r>
+              <w:t>Техническая основа воспроизводима. Полная приёмка ограничена статусом PR In Review и замечаниями к отчётам/evidence.</w:t>
+            </w:r>
+          </w:p>
+        </w:tc>
+      </w:tr>
+      <w:tr>
+        <w:tc>
+          <w:tcPr>
+            <w:tcW w:type="dxa" w:w="2339"/>
+          </w:tcPr>
+          <w:p>
+            <w:r>
+              <w:t>Архитектурные решения</w:t>
+            </w:r>
+          </w:p>
+        </w:tc>
+        <w:tc>
+          <w:tcPr>
+            <w:tcW w:type="dxa" w:w="2339"/>
+          </w:tcPr>
+          <w:p>
+            <w:r>
+              <w:t>Partial</w:t>
+            </w:r>
+          </w:p>
+        </w:tc>
+        <w:tc>
+          <w:tcPr>
+            <w:tcW w:type="dxa" w:w="2339"/>
+          </w:tcPr>
+          <w:p>
+            <w:r>
+              <w:t>В PR32 есть module-map.md, module-adr.md и complexity-profile.md для Intake.</w:t>
+            </w:r>
+          </w:p>
+        </w:tc>
+        <w:tc>
+          <w:tcPr>
+            <w:tcW w:type="dxa" w:w="2339"/>
+          </w:tcPr>
+          <w:p>
+            <w:r>
+              <w:t>Локальная граница модуля обоснована. Отдельного авторского сравнения NATS/Kafka с критериями и измерениями не найдено; канонический HP-ADR-002 рассматривает broker как не нужный для MVP без измеренного основания.</w:t>
+            </w:r>
+          </w:p>
+        </w:tc>
+      </w:tr>
+      <w:tr>
+        <w:tc>
+          <w:tcPr>
+            <w:tcW w:type="dxa" w:w="2339"/>
+          </w:tcPr>
+          <w:p>
+            <w:r>
+              <w:t>Технические эксперименты HIT-8</w:t>
+            </w:r>
+          </w:p>
+        </w:tc>
+        <w:tc>
+          <w:tcPr>
+            <w:tcW w:type="dxa" w:w="2339"/>
+          </w:tcPr>
+          <w:p>
+            <w:r>
+              <w:t>Fail / evidence not found</w:t>
+            </w:r>
+          </w:p>
+        </w:tc>
+        <w:tc>
+          <w:tcPr>
+            <w:tcW w:type="dxa" w:w="2339"/>
+          </w:tcPr>
+          <w:p>
+            <w:r>
+              <w:t>В проверенных PR и ветках Никиты нет отдельного артефакта HIT-8, PoC или отчёта эксперимента, который можно связать с его авторством.</w:t>
+            </w:r>
+          </w:p>
+        </w:tc>
+        <w:tc>
+          <w:tcPr>
+            <w:tcW w:type="dxa" w:w="2339"/>
+          </w:tcPr>
+          <w:p>
+            <w:r>
+              <w:t>Участие в HIT-8 нельзя засчитать без ссылки на конкретный PR, commit или отчёт.</w:t>
+            </w:r>
+          </w:p>
+        </w:tc>
+      </w:tr>
+      <w:tr>
+        <w:tc>
+          <w:tcPr>
+            <w:tcW w:type="dxa" w:w="2339"/>
+          </w:tcPr>
+          <w:p>
+            <w:r>
+              <w:t>Code review коллег</w:t>
+            </w:r>
+          </w:p>
+        </w:tc>
+        <w:tc>
+          <w:tcPr>
+            <w:tcW w:type="dxa" w:w="2339"/>
+          </w:tcPr>
+          <w:p>
+            <w:r>
+              <w:t>Not confirmed</w:t>
+            </w:r>
+          </w:p>
+        </w:tc>
+        <w:tc>
+          <w:tcPr>
+            <w:tcW w:type="dxa" w:w="2339"/>
+          </w:tcPr>
+          <w:p>
+            <w:r>
+              <w:t>В доступном наборе PR найдены авторские PR Никиты и ревью PR №36 о его пакете; подтверждённых review Никиты чужих PR не найдено.</w:t>
+            </w:r>
+          </w:p>
+        </w:tc>
+        <w:tc>
+          <w:tcPr>
+            <w:tcW w:type="dxa" w:w="2339"/>
+          </w:tcPr>
+          <w:p>
+            <w:r>
+              <w:t>Качество замечаний Никиты коллегам по доступным данным оценить нельзя.</w:t>
+            </w:r>
+          </w:p>
+        </w:tc>
+      </w:tr>
+      <w:tr>
+        <w:tc>
+          <w:tcPr>
+            <w:tcW w:type="dxa" w:w="2339"/>
+          </w:tcPr>
+          <w:p>
+            <w:r>
+              <w:t>Документирование</w:t>
+            </w:r>
+          </w:p>
+        </w:tc>
+        <w:tc>
+          <w:tcPr>
+            <w:tcW w:type="dxa" w:w="2339"/>
+          </w:tcPr>
+          <w:p>
+            <w:r>
+              <w:t>Pass / Partial</w:t>
+            </w:r>
+          </w:p>
+        </w:tc>
+        <w:tc>
+          <w:tcPr>
+            <w:tcW w:type="dxa" w:w="2339"/>
+          </w:tcPr>
+          <w:p>
+            <w:r>
+              <w:t>PR31–33 добавляют module-contract, README, test-design, coverage/risk/mutation документы; PR37–40 добавляют requirements, refinement, toolchain и human-gate документы.</w:t>
+            </w:r>
+          </w:p>
+        </w:tc>
+        <w:tc>
+          <w:tcPr>
+            <w:tcW w:type="dxa" w:w="2339"/>
+          </w:tcPr>
+          <w:p>
+            <w:r>
+              <w:t>Документационный объём значительный, но PR36 выявил несогласованности DOCX/JSON, пустые технические таблицы и неточные команды.</w:t>
+            </w:r>
+          </w:p>
+        </w:tc>
+      </w:tr>
+    </w:tbl>
+    <w:p>
+      <w:r>
+        <w:t>Итог блока 1: технический вклад подтверждён по модулю Intake и связанным проверкам, но общий зачёт — «на доработку». Для зачёта заявленного общего вклада нужны отдельные артефакты HIT-8, подтверждение архитектурного сравнения брокеров и реальные записи code review коллег.</w:t>
+      </w:r>
+    </w:p>
+    <w:p>
+      <w:pPr>
+        <w:pStyle w:val="2"/>
+      </w:pPr>
+      <w:r>
+        <w:t>3.3 Оценка влияния на каркас проекта</w:t>
+      </w:r>
+    </w:p>
+    <w:p>
+      <w:r>
+        <w:t>Проверка каркаса выполнена по изменённым файлам PR №31–33 и сопутствующим PR №37–40. Результат не расширяет область авторства Никиты за пределы фактически изменённых путей.</w:t>
+      </w:r>
+    </w:p>
+    <w:tbl>
+      <w:tblPr>
+        <w:tblStyle w:val="af4"/>
+        <w:tblW w:type="auto" w:w="0"/>
+        <w:tblLook w:firstColumn="1" w:firstRow="1" w:lastColumn="0" w:lastRow="0" w:noHBand="0" w:noVBand="1" w:val="04A0"/>
+      </w:tblPr>
+      <w:tblGrid>
+        <w:gridCol w:w="2339"/>
+        <w:gridCol w:w="2339"/>
+        <w:gridCol w:w="2339"/>
+        <w:gridCol w:w="2339"/>
+      </w:tblGrid>
+      <w:tr>
+        <w:tc>
+          <w:tcPr>
+            <w:tcW w:type="dxa" w:w="2339"/>
+          </w:tcPr>
+          <w:p>
+            <w:r>
+              <w:t>Область каркаса</w:t>
+            </w:r>
+          </w:p>
+        </w:tc>
+        <w:tc>
+          <w:tcPr>
+            <w:tcW w:type="dxa" w:w="2339"/>
+          </w:tcPr>
+          <w:p>
+            <w:r>
+              <w:t>Статус</w:t>
+            </w:r>
+          </w:p>
+        </w:tc>
+        <w:tc>
+          <w:tcPr>
+            <w:tcW w:type="dxa" w:w="2339"/>
+          </w:tcPr>
+          <w:p>
+            <w:r>
+              <w:t>Фактическое свидетельство</w:t>
+            </w:r>
+          </w:p>
+        </w:tc>
+        <w:tc>
+          <w:tcPr>
+            <w:tcW w:type="dxa" w:w="2339"/>
+          </w:tcPr>
+          <w:p>
+            <w:r>
+              <w:t>Ограничение оценки</w:t>
+            </w:r>
+          </w:p>
+        </w:tc>
+      </w:tr>
+      <w:tr>
+        <w:tc>
+          <w:tcPr>
+            <w:tcW w:type="dxa" w:w="2339"/>
+          </w:tcPr>
+          <w:p>
+            <w:r>
+              <w:t>Backend hitpipe</w:t>
+            </w:r>
+          </w:p>
+        </w:tc>
+        <w:tc>
+          <w:tcPr>
+            <w:tcW w:type="dxa" w:w="2339"/>
+          </w:tcPr>
+          <w:p>
+            <w:r>
+              <w:t>Pass / bounded</w:t>
+            </w:r>
+          </w:p>
+        </w:tc>
+        <w:tc>
+          <w:tcPr>
+            <w:tcW w:type="dxa" w:w="2339"/>
+          </w:tcPr>
+          <w:p>
+            <w:r>
+              <w:t>Добавлен services/intake: domain StripeSignature, application AuthenticateWebhook, file/in-memory adapters, fixtures и contract-check CLI.</w:t>
+            </w:r>
+          </w:p>
+        </w:tc>
+        <w:tc>
+          <w:tcPr>
+            <w:tcW w:type="dxa" w:w="2339"/>
+          </w:tcPr>
+          <w:p>
+            <w:r>
+              <w:t>Это отдельный Intake-контур; доказательств изменений в delivery/processing/iam или полном backend runtime нет.</w:t>
+            </w:r>
+          </w:p>
+        </w:tc>
+      </w:tr>
+      <w:tr>
+        <w:tc>
+          <w:tcPr>
+            <w:tcW w:type="dxa" w:w="2339"/>
+          </w:tcPr>
+          <w:p>
+            <w:r>
+              <w:t>Тестовый слой</w:t>
+            </w:r>
+          </w:p>
+        </w:tc>
+        <w:tc>
+          <w:tcPr>
+            <w:tcW w:type="dxa" w:w="2339"/>
+          </w:tcPr>
+          <w:p>
+            <w:r>
+              <w:t>Pass</w:t>
+            </w:r>
+          </w:p>
+        </w:tc>
+        <w:tc>
+          <w:tcPr>
+            <w:tcW w:type="dxa" w:w="2339"/>
+          </w:tcPr>
+          <w:p>
+            <w:r>
+              <w:t>verifier_test.go, authenticate_test.go, testdata, coverage-analysis и пять mutation patches/logs.</w:t>
+            </w:r>
+          </w:p>
+        </w:tc>
+        <w:tc>
+          <w:tcPr>
+            <w:tcW w:type="dxa" w:w="2339"/>
+          </w:tcPr>
+          <w:p>
+            <w:r>
+              <w:t>Тесты synthetic/offline; live provider, durable receipt и production admission не подтверждены.</w:t>
+            </w:r>
+          </w:p>
+        </w:tc>
+      </w:tr>
+      <w:tr>
+        <w:tc>
+          <w:tcPr>
+            <w:tcW w:type="dxa" w:w="2339"/>
+          </w:tcPr>
+          <w:p>
+            <w:r>
+              <w:t>CI</w:t>
+            </w:r>
+          </w:p>
+        </w:tc>
+        <w:tc>
+          <w:tcPr>
+            <w:tcW w:type="dxa" w:w="2339"/>
+          </w:tcPr>
+          <w:p>
+            <w:r>
+              <w:t>Partial</w:t>
+            </w:r>
+          </w:p>
+        </w:tc>
+        <w:tc>
+          <w:tcPr>
+            <w:tcW w:type="dxa" w:w="2339"/>
+          </w:tcPr>
+          <w:p>
+            <w:r>
+              <w:t>PR33 добавляет .github/workflows/pr12-nb.yml и CI sensitivity evidence.</w:t>
+            </w:r>
+          </w:p>
+        </w:tc>
+        <w:tc>
+          <w:tcPr>
+            <w:tcW w:type="dxa" w:w="2339"/>
+          </w:tcPr>
+          <w:p>
+            <w:r>
+              <w:t>Один workflow не доказывает общую зрелость CI/CD проекта и не заменяет merge/acceptance.</w:t>
+            </w:r>
+          </w:p>
+        </w:tc>
+      </w:tr>
+      <w:tr>
+        <w:tc>
+          <w:tcPr>
+            <w:tcW w:type="dxa" w:w="2339"/>
+          </w:tcPr>
+          <w:p>
+            <w:r>
+              <w:t>Docker, Compose, .air.toml</w:t>
+            </w:r>
+          </w:p>
+        </w:tc>
+        <w:tc>
+          <w:tcPr>
+            <w:tcW w:type="dxa" w:w="2339"/>
+          </w:tcPr>
+          <w:p>
+            <w:r>
+              <w:t>Not confirmed</w:t>
+            </w:r>
+          </w:p>
+        </w:tc>
+        <w:tc>
+          <w:tcPr>
+            <w:tcW w:type="dxa" w:w="2339"/>
+          </w:tcPr>
+          <w:p>
+            <w:r>
+              <w:t>В списках изменённых файлов PR31–40 такие артефакты Никиты не обнаружены.</w:t>
+            </w:r>
+          </w:p>
+        </w:tc>
+        <w:tc>
+          <w:tcPr>
+            <w:tcW w:type="dxa" w:w="2339"/>
+          </w:tcPr>
+          <w:p>
+            <w:r>
+              <w:t>Нельзя приписывать ему инфраструктурные изменения без конкретного файла и commit.</w:t>
+            </w:r>
+          </w:p>
+        </w:tc>
+      </w:tr>
+      <w:tr>
+        <w:tc>
+          <w:tcPr>
+            <w:tcW w:type="dxa" w:w="2339"/>
+          </w:tcPr>
+          <w:p>
+            <w:r>
+              <w:t>Миграции БД и seed-данные</w:t>
+            </w:r>
+          </w:p>
+        </w:tc>
+        <w:tc>
+          <w:tcPr>
+            <w:tcW w:type="dxa" w:w="2339"/>
+          </w:tcPr>
+          <w:p>
+            <w:r>
+              <w:t>Not confirmed</w:t>
+            </w:r>
+          </w:p>
+        </w:tc>
+        <w:tc>
+          <w:tcPr>
+            <w:tcW w:type="dxa" w:w="2339"/>
+          </w:tcPr>
+          <w:p>
+            <w:r>
+              <w:t>В изменённых файлах PR31–40 миграции и seed-артефакты не обнаружены.</w:t>
+            </w:r>
+          </w:p>
+        </w:tc>
+        <w:tc>
+          <w:tcPr>
+            <w:tcW w:type="dxa" w:w="2339"/>
+          </w:tcPr>
+          <w:p>
+            <w:r>
+              <w:t>Intake-пакет не включает durable database ownership или миграционный процесс.</w:t>
+            </w:r>
+          </w:p>
+        </w:tc>
+      </w:tr>
+      <w:tr>
+        <w:tc>
+          <w:tcPr>
+            <w:tcW w:type="dxa" w:w="2339"/>
+          </w:tcPr>
+          <w:p>
+            <w:r>
+              <w:t>Архитектурные артефакты</w:t>
+            </w:r>
+          </w:p>
+        </w:tc>
+        <w:tc>
+          <w:tcPr>
+            <w:tcW w:type="dxa" w:w="2339"/>
+          </w:tcPr>
+          <w:p>
+            <w:r>
+              <w:t>Pass / Partial</w:t>
+            </w:r>
+          </w:p>
+        </w:tc>
+        <w:tc>
+          <w:tcPr>
+            <w:tcW w:type="dxa" w:w="2339"/>
+          </w:tcPr>
+          <w:p>
+            <w:r>
+              <w:t>Есть module-contract, module-map, module-adr, complexity-profile, requirements и refinement documents.</w:t>
+            </w:r>
+          </w:p>
+        </w:tc>
+        <w:tc>
+          <w:tcPr>
+            <w:tcW w:type="dxa" w:w="2339"/>
+          </w:tcPr>
+          <w:p>
+            <w:r>
+              <w:t>Нет подтверждённых авторских диаграмм БД, OpenAPI-изменений или самостоятельного ADR по NATS/Kafka.</w:t>
+            </w:r>
+          </w:p>
+        </w:tc>
+      </w:tr>
+    </w:tbl>
+    <w:p>
+      <w:r>
+        <w:t>Итог блока 2: влияние на каркас положительное, но ограниченное Intake-модулем, его тестами и CI-маршрутом. Общая оценка — «требует доработки», если заявляется вклад в Docker, БД, брокеры или весь backend без дополнительных ссылок.</w:t>
+      </w:r>
+    </w:p>
+    <w:p>
+      <w:pPr>
+        <w:pStyle w:val="2"/>
+      </w:pPr>
+      <w:r>
+        <w:t>3.4 Внешнее оппонирование технического вклада</w:t>
+      </w:r>
+    </w:p>
+    <w:p>
+      <w:r>
+        <w:t>Ниже приведена симуляция вопросов внешнего эксперта. Это не проведённое интервью и не подтверждение личной защиты Никиты. Ответы основаны только на доступных PR и должны быть подтверждены автором на реальном human gate.</w:t>
+      </w:r>
+    </w:p>
+    <w:tbl>
+      <w:tblPr>
+        <w:tblStyle w:val="af4"/>
+        <w:tblW w:type="auto" w:w="0"/>
+        <w:tblLook w:firstColumn="1" w:firstRow="1" w:lastColumn="0" w:lastRow="0" w:noHBand="0" w:noVBand="1" w:val="04A0"/>
+      </w:tblPr>
+      <w:tblGrid>
+        <w:gridCol w:w="3118"/>
+        <w:gridCol w:w="3118"/>
+        <w:gridCol w:w="3118"/>
+      </w:tblGrid>
+      <w:tr>
+        <w:tc>
+          <w:tcPr>
+            <w:tcW w:type="dxa" w:w="3118"/>
+          </w:tcPr>
+          <w:p>
+            <w:r>
+              <w:t>Вопрос эксперта</w:t>
+            </w:r>
+          </w:p>
+        </w:tc>
+        <w:tc>
+          <w:tcPr>
+            <w:tcW w:type="dxa" w:w="3118"/>
+          </w:tcPr>
+          <w:p>
+            <w:r>
+              <w:t>Что уже видно по артефактам</w:t>
+            </w:r>
+          </w:p>
+        </w:tc>
+        <w:tc>
+          <w:tcPr>
+            <w:tcW w:type="dxa" w:w="3118"/>
+          </w:tcPr>
+          <w:p>
+            <w:r>
+              <w:t>Что Никита должен дополнительно показать</w:t>
+            </w:r>
+          </w:p>
+        </w:tc>
+      </w:tr>
+      <w:tr>
+        <w:tc>
+          <w:tcPr>
+            <w:tcW w:type="dxa" w:w="3118"/>
+          </w:tcPr>
+          <w:p>
+            <w:r>
+              <w:t>Какие конкретные эксперименты выполнены по HIT-8? Где отчёты и PoC?</w:t>
+            </w:r>
+          </w:p>
+        </w:tc>
+        <w:tc>
+          <w:tcPr>
+            <w:tcW w:type="dxa" w:w="3118"/>
+          </w:tcPr>
+          <w:p>
+            <w:r>
+              <w:t>В PR31–40 отдельный HIT-8-артефакт не найден.</w:t>
+            </w:r>
+          </w:p>
+        </w:tc>
+        <w:tc>
+          <w:tcPr>
+            <w:tcW w:type="dxa" w:w="3118"/>
+          </w:tcPr>
+          <w:p>
+            <w:r>
+              <w:t>Ссылку на exact task, branch, commit, журнал запуска и вывод о критериях эксперимента.</w:t>
+            </w:r>
+          </w:p>
+        </w:tc>
+      </w:tr>
+      <w:tr>
+        <w:tc>
+          <w:tcPr>
+            <w:tcW w:type="dxa" w:w="3118"/>
+          </w:tcPr>
+          <w:p>
+            <w:r>
+              <w:t>Почему выбраны NATS/Kafka? Каковы критерии сравнения? Где ADR?</w:t>
+            </w:r>
+          </w:p>
+        </w:tc>
+        <w:tc>
+          <w:tcPr>
+            <w:tcW w:type="dxa" w:w="3118"/>
+          </w:tcPr>
+          <w:p>
+            <w:r>
+              <w:t>В доступном пакете есть локальный ADR Intake; канонический HP-ADR-002 говорит, что broker не нужен MVP без измеренного основания.</w:t>
+            </w:r>
+          </w:p>
+        </w:tc>
+        <w:tc>
+          <w:tcPr>
+            <w:tcW w:type="dxa" w:w="3118"/>
+          </w:tcPr>
+          <w:p>
+            <w:r>
+              <w:t>Авторское сравнение вариантов, критерии fan-out/replay/latency/операционной стоимости и ссылку на собственный ADR либо явный отказ от решения.</w:t>
+            </w:r>
+          </w:p>
+        </w:tc>
+      </w:tr>
+      <w:tr>
+        <w:tc>
+          <w:tcPr>
+            <w:tcW w:type="dxa" w:w="3118"/>
+          </w:tcPr>
+          <w:p>
+            <w:r>
+              <w:t>Как тестируется асинхронная обработка webhook и повторная доставка?</w:t>
+            </w:r>
+          </w:p>
+        </w:tc>
+        <w:tc>
+          <w:tcPr>
+            <w:tcW w:type="dxa" w:w="3118"/>
+          </w:tcPr>
+          <w:p>
+            <w:r>
+              <w:t>Подтверждены raw-body HMAC, freshness, safe reject и mutation tests; live delivery/durable receipt не заявлены.</w:t>
+            </w:r>
+          </w:p>
+        </w:tc>
+        <w:tc>
+          <w:tcPr>
+            <w:tcW w:type="dxa" w:w="3118"/>
+          </w:tcPr>
+          <w:p>
+            <w:r>
+              <w:t>Сценарии очереди, повторов, crash до/после ACK, idempotency и доказательство durable boundary.</w:t>
+            </w:r>
+          </w:p>
+        </w:tc>
+      </w:tr>
+      <w:tr>
+        <w:tc>
+          <w:tcPr>
+            <w:tcW w:type="dxa" w:w="3118"/>
+          </w:tcPr>
+          <w:p>
+            <w:r>
+              <w:t>Есть ли бенчмарки производительности и как измеряется latency?</w:t>
+            </w:r>
+          </w:p>
+        </w:tc>
+        <w:tc>
+          <w:tcPr>
+            <w:tcW w:type="dxa" w:w="3118"/>
+          </w:tcPr>
+          <w:p>
+            <w:r>
+              <w:t>В evidence есть функциональные тесты и coverage; performance claim не подтверждён.</w:t>
+            </w:r>
+          </w:p>
+        </w:tc>
+        <w:tc>
+          <w:tcPr>
+            <w:tcW w:type="dxa" w:w="3118"/>
+          </w:tcPr>
+          <w:p>
+            <w:r>
+              <w:t>Команду, среду, dataset, число повторов, метрики и журнал benchmark либо честное ограничение «не измерялось».</w:t>
+            </w:r>
+          </w:p>
+        </w:tc>
+      </w:tr>
+      <w:tr>
+        <w:tc>
+          <w:tcPr>
+            <w:tcW w:type="dxa" w:w="3118"/>
+          </w:tcPr>
+          <w:p>
+            <w:r>
+              <w:t>Как организована миграция схемы БД и rollback?</w:t>
+            </w:r>
+          </w:p>
+        </w:tc>
+        <w:tc>
+          <w:tcPr>
+            <w:tcW w:type="dxa" w:w="3118"/>
+          </w:tcPr>
+          <w:p>
+            <w:r>
+              <w:t>В PR31–40 нет migration/seed-файлов Никиты; Intake-пакет не включает durable DB.</w:t>
+            </w:r>
+          </w:p>
+        </w:tc>
+        <w:tc>
+          <w:tcPr>
+            <w:tcW w:type="dxa" w:w="3118"/>
+          </w:tcPr>
+          <w:p>
+            <w:r>
+              <w:t>Показать владельца схемы, migration plan и rollback, либо явно исключить эту ответственность из вклада.</w:t>
+            </w:r>
+          </w:p>
+        </w:tc>
+      </w:tr>
+    </w:tbl>
+    <w:p>
+      <w:r>
+        <w:t>Подпись ревьюера: Дмитрий Стацюк, участник команды HitPipe. Дата: 19.10.2026. Формат: самостоятельное документальное ревью и симуляция внешних вопросов; реальное оппонирование/защита не заявлены.</w:t>
+      </w:r>
+    </w:p>
+    <w:p>
+      <w:r>
+        <w:t>Итоговое решение по полному ревью Никиты: на доработку. Подтверждён сильный локальный вклад в Intake/StripeSignature, тестирование, mutation evidence, документацию и CI-маршрут. Не подтверждены общий вклад в HIT-8, личные эксперименты NATS/Kafka, Docker/БД-инфраструктура и code review коллег. Статус не является оценкой преподавателя и не означает merge или formal acceptance.</w:t>
       </w:r>
     </w:p>
     <w:p>

</xml_diff>